<commit_message>
Report: add memory/speed summary figure, consistent figure labels, accurate per-query correlation claims
</commit_message>
<xml_diff>
--- a/report/group_21_report.docx
+++ b/report/group_21_report.docx
@@ -255,7 +255,7 @@
         <w:t xml:space="preserve">HNSW</w:t>
       </w:r>
       <w:r>
-        <w:t xml:space="preserve"> (graph), which is outside the course and is the default index in vector databases such as pgvector, Milvus and Weaviate. We expected PQ, whose centroids are fitted to images, to suffer most from text queries, and LSH to suffer least. The results were the opposite, and explaining why became the main thread of this report. We:</w:t>
+        <w:t xml:space="preserve"> (graph), which is outside the course and is widely used in vector databases such as pgvector, Milvus and Weaviate. We expected PQ, whose centroids are fitted to images, to suffer most from text queries, and LSH to suffer least. The results were the opposite, and explaining why became the main thread of this report. We:</w:t>
       </w:r>
     </w:p>
     <w:p>
@@ -864,7 +864,7 @@
           <w:sz w:val="19"/>
           <w:szCs w:val="19"/>
         </w:rPr>
-        <w:t xml:space="preserve">: HNSW search list size.</w:t>
+        <w:t xml:space="preserve">: HNSW search list size (efSearch in FAISS).</w:t>
       </w:r>
     </w:p>
     <w:tbl>
@@ -5397,7 +5397,7 @@
         <w:t xml:space="preserve">Metrics.</w:t>
       </w:r>
       <w:r>
-        <w:t xml:space="preserve"> Our main metric is recall@100 (Eq. 1). We also report recall@10, queries per second (QPS), index size in bytes per vector and build time. The gap between the two query types, on the same index with the same setting, is</w:t>
+        <w:t xml:space="preserve"> Our main metric is recall@100 (Eq. 1). We also report queries per second (QPS), index size in bytes per vector and build time. The gap between the two query types, on the same index with the same setting, is</w:t>
       </w:r>
     </w:p>
     <w:p>
@@ -6564,7 +6564,7 @@
       <w:r>
         <w:drawing>
           <wp:inline distT="0" distB="0" distL="0" distR="0">
-            <wp:extent cx="5581650" cy="2771775"/>
+            <wp:extent cx="5581650" cy="2743200"/>
             <wp:effectExtent t="0" r="0" b="0" l="0"/>
             <wp:docPr id="1" name="fig2_recall_vs_qps.png" descr="Recall@100 vs single-thread queries per second. Colour shows the method; solid lines and filled markers are image queries, dashed lines and hollow markers are text queries; the star is linear search." title="Figure 2"/>
             <wp:cNvGraphicFramePr>
@@ -6589,7 +6589,7 @@
                   <pic:spPr bwMode="auto">
                     <a:xfrm>
                       <a:off x="0" y="0"/>
-                      <a:ext cx="5581650" cy="2771775"/>
+                      <a:ext cx="5581650" cy="2743200"/>
                     </a:xfrm>
                     <a:prstGeom prst="rect">
                       <a:avLst/>
@@ -6634,7 +6634,7 @@
       <w:r>
         <w:drawing>
           <wp:inline distT="0" distB="0" distL="0" distR="0">
-            <wp:extent cx="5581650" cy="2828925"/>
+            <wp:extent cx="5581650" cy="2819400"/>
             <wp:effectExtent t="0" r="0" b="0" l="0"/>
             <wp:docPr id="1" name="fig3_recall_vs_memory.png" descr="Recall@100 vs index size in bytes per vector." title="Figure 3"/>
             <wp:cNvGraphicFramePr>
@@ -6659,7 +6659,7 @@
                   <pic:spPr bwMode="auto">
                     <a:xfrm>
                       <a:off x="0" y="0"/>
-                      <a:ext cx="5581650" cy="2828925"/>
+                      <a:ext cx="5581650" cy="2819400"/>
                     </a:xfrm>
                     <a:prstGeom prst="rect">
                       <a:avLst/>
@@ -8986,6 +8986,85 @@
     <w:p>
       <w:pPr>
         <w:keepNext/>
+        <w:spacing w:before="160" w:after="60"/>
+        <w:jc w:val="center"/>
+      </w:pPr>
+      <w:r>
+        <w:drawing>
+          <wp:inline distT="0" distB="0" distL="0" distR="0">
+            <wp:extent cx="5581650" cy="2152650"/>
+            <wp:effectExtent t="0" r="0" b="0" l="0"/>
+            <wp:docPr id="1" name="fig_summary_tradeoff.png" descr="The trade-off at each method's best setting (Table 4): memory against speed, labelled with recall@100 for image / text queries. Up and to the left is better." title="Figure 4"/>
+            <wp:cNvGraphicFramePr>
+              <a:graphicFrameLocks xmlns:a="http://schemas.openxmlformats.org/drawingml/2006/main" noChangeAspect="1"/>
+            </wp:cNvGraphicFramePr>
+            <a:graphic xmlns:a="http://schemas.openxmlformats.org/drawingml/2006/main">
+              <a:graphicData uri="http://schemas.openxmlformats.org/drawingml/2006/picture">
+                <pic:pic xmlns:pic="http://schemas.openxmlformats.org/drawingml/2006/picture">
+                  <pic:nvPicPr>
+                    <pic:cNvPr id="0" name="" descr=""/>
+                    <pic:cNvPicPr>
+                      <a:picLocks noChangeAspect="1" noChangeArrowheads="1"/>
+                    </pic:cNvPicPr>
+                  </pic:nvPicPr>
+                  <pic:blipFill>
+                    <a:blip r:embed="rId11" cstate="none"/>
+                    <a:srcRect/>
+                    <a:stretch>
+                      <a:fillRect/>
+                    </a:stretch>
+                  </pic:blipFill>
+                  <pic:spPr bwMode="auto">
+                    <a:xfrm>
+                      <a:off x="0" y="0"/>
+                      <a:ext cx="5581650" cy="2152650"/>
+                    </a:xfrm>
+                    <a:prstGeom prst="rect">
+                      <a:avLst/>
+                    </a:prstGeom>
+                  </pic:spPr>
+                </pic:pic>
+              </a:graphicData>
+            </a:graphic>
+          </wp:inline>
+        </w:drawing>
+      </w:r>
+    </w:p>
+    <w:p>
+      <w:pPr>
+        <w:spacing w:after="220" w:line="240"/>
+        <w:ind w:left="360" w:right="360"/>
+        <w:jc w:val="both"/>
+      </w:pPr>
+      <w:r>
+        <w:rPr>
+          <w:b/>
+          <w:bCs/>
+          <w:sz w:val="19"/>
+          <w:szCs w:val="19"/>
+        </w:rPr>
+        <w:t xml:space="preserve">Figure 4. </w:t>
+      </w:r>
+      <w:r>
+        <w:rPr>
+          <w:sz w:val="19"/>
+          <w:szCs w:val="19"/>
+        </w:rPr>
+        <w:t xml:space="preserve">The trade-off at each method's best setting (Table 4): memory against speed, labelled with recall@100 for image / text queries. Up and to the left is better.</w:t>
+      </w:r>
+    </w:p>
+    <w:p>
+      <w:pPr>
+        <w:spacing w:after="120" w:line="264"/>
+        <w:jc w:val="both"/>
+      </w:pPr>
+      <w:r>
+        <w:t xml:space="preserve">Figure 4 puts the three trade-offs in one picture. HNSW is the fastest and most accurate but uses more memory than linear search; PQ uses the least memory but has the lowest recall; LSH sits in between on memory and is barely faster than linear search. No method wins on all three.</w:t>
+      </w:r>
+    </w:p>
+    <w:p>
+      <w:pPr>
+        <w:keepNext/>
         <w:spacing w:before="200" w:after="80" w:line="240"/>
         <w:jc w:val="both"/>
       </w:pPr>
@@ -9840,7 +9919,7 @@
           <wp:inline distT="0" distB="0" distL="0" distR="0">
             <wp:extent cx="5581650" cy="2733675"/>
             <wp:effectExtent t="0" r="0" b="0" l="0"/>
-            <wp:docPr id="1" name="fig4_param_sweep_gap.png" descr="Image (solid) and text (dashed) recall@100 across each method's parameter. The shaded area is the gap Δ." title="Figure 4"/>
+            <wp:docPr id="1" name="fig4_param_sweep_gap.png" descr="Image (solid) and text (dashed) recall@100 across each method's parameter. The shaded area is the gap Δ." title="Figure 5"/>
             <wp:cNvGraphicFramePr>
               <a:graphicFrameLocks xmlns:a="http://schemas.openxmlformats.org/drawingml/2006/main" noChangeAspect="1"/>
             </wp:cNvGraphicFramePr>
@@ -9854,7 +9933,7 @@
                     </pic:cNvPicPr>
                   </pic:nvPicPr>
                   <pic:blipFill>
-                    <a:blip r:embed="rId11" cstate="none"/>
+                    <a:blip r:embed="rId12" cstate="none"/>
                     <a:srcRect/>
                     <a:stretch>
                       <a:fillRect/>
@@ -9889,7 +9968,7 @@
           <w:sz w:val="19"/>
           <w:szCs w:val="19"/>
         </w:rPr>
-        <w:t xml:space="preserve">Figure 4. </w:t>
+        <w:t xml:space="preserve">Figure 5. </w:t>
       </w:r>
       <w:r>
         <w:rPr>
@@ -11074,7 +11153,7 @@
         <w:jc w:val="both"/>
       </w:pPr>
       <w:r>
-        <w:t xml:space="preserve">Every method loses recall on text queries at every setting (Figure 4, Table 6). The parameters behave differently. For HNSW, a larger </w:t>
+        <w:t xml:space="preserve">Every method loses recall on text queries at every setting (Figure 5, Table 6). The parameters behave differently. For HNSW, a larger </w:t>
       </w:r>
       <m:oMath>
         <m:r>
@@ -11120,7 +11199,7 @@
           <wp:inline distT="0" distB="0" distL="0" distR="0">
             <wp:extent cx="5581650" cy="3552825"/>
             <wp:effectExtent t="0" r="0" b="0" l="0"/>
-            <wp:docPr id="1" name="fig5_which_queries_fail.png" descr="Per-query recall@100, with queries grouped into 12 equal-size bins. Left: HNSW against the query's similarity to its nearest image, $s_{(1)}$. Right: PQ against the neighbour contrast $γ$." title="Figure 5"/>
+            <wp:docPr id="1" name="fig5_which_queries_fail.png" descr="Per-query recall@100, with queries grouped into 12 equal-size bins. Left: HNSW ($ef$ = 128) against the query's similarity to its nearest image, $s_{(1)}$. Right: PQ ($M$ = 64) against the neighbour contrast $γ$." title="Figure 6"/>
             <wp:cNvGraphicFramePr>
               <a:graphicFrameLocks xmlns:a="http://schemas.openxmlformats.org/drawingml/2006/main" noChangeAspect="1"/>
             </wp:cNvGraphicFramePr>
@@ -11134,7 +11213,7 @@
                     </pic:cNvPicPr>
                   </pic:nvPicPr>
                   <pic:blipFill>
-                    <a:blip r:embed="rId12" cstate="none"/>
+                    <a:blip r:embed="rId13" cstate="none"/>
                     <a:srcRect/>
                     <a:stretch>
                       <a:fillRect/>
@@ -11169,14 +11248,26 @@
           <w:sz w:val="19"/>
           <w:szCs w:val="19"/>
         </w:rPr>
-        <w:t xml:space="preserve">Figure 5. </w:t>
+        <w:t xml:space="preserve">Figure 6. </w:t>
       </w:r>
       <w:r>
         <w:rPr>
           <w:sz w:val="19"/>
           <w:szCs w:val="19"/>
         </w:rPr>
-        <w:t xml:space="preserve">Per-query recall@100, with queries grouped into 12 equal-size bins. Left: HNSW against the query's similarity to its nearest image, </w:t>
+        <w:t xml:space="preserve">Per-query recall@100, with queries grouped into 12 equal-size bins. Left: HNSW (</w:t>
+      </w:r>
+      <m:oMath>
+        <m:r>
+          <m:t xml:space="preserve">ef</m:t>
+        </m:r>
+      </m:oMath>
+      <w:r>
+        <w:rPr>
+          <w:sz w:val="19"/>
+          <w:szCs w:val="19"/>
+        </w:rPr>
+        <w:t xml:space="preserve"> = 128) against the query's similarity to its nearest image, </w:t>
       </w:r>
       <m:oMath>
         <m:sSub>
@@ -11198,7 +11289,19 @@
           <w:sz w:val="19"/>
           <w:szCs w:val="19"/>
         </w:rPr>
-        <w:t xml:space="preserve">. Right: PQ against the neighbour contrast </w:t>
+        <w:t xml:space="preserve">. Right: PQ (</w:t>
+      </w:r>
+      <m:oMath>
+        <m:r>
+          <m:t xml:space="preserve">M</m:t>
+        </m:r>
+      </m:oMath>
+      <w:r>
+        <w:rPr>
+          <w:sz w:val="19"/>
+          <w:szCs w:val="19"/>
+        </w:rPr>
+        <w:t xml:space="preserve"> = 64) against the neighbour contrast </w:t>
       </w:r>
       <m:oMath>
         <m:r>
@@ -11226,7 +11329,7 @@
         <w:t xml:space="preserve">(P1) Low contrast hurts PQ and LSH.</w:t>
       </w:r>
       <w:r>
-        <w:t xml:space="preserve"> For PQ, per-query recall increases with contrast (Spearman correlation up to +0.51; Figure 5, right), and 39% of COCO text queries get recall below 0.5, against 3% of image queries. The PQ score error is actually </w:t>
+        <w:t xml:space="preserve"> For PQ, per-query recall increases with contrast for COCO image and text queries and LAION image queries (Spearman correlation +0.38, +0.51 and +0.33; Figure 6, right), and 39% of COCO text queries get recall below 0.5, against 3% of image queries. LAION text queries are the exception: their recall first rises and then falls with contrast (+0.14), so contrast explains only part of the loss on noisy web text. The PQ score error is actually </w:t>
       </w:r>
       <w:r>
         <w:rPr>
@@ -12869,7 +12972,7 @@
         </m:r>
       </m:oMath>
       <w:r>
-        <w:t xml:space="preserve">, recall 0.504), which matches the shift between the two LSH curves in Figure 4. LSH suffers most because it cannot adapt: unlike PQ, nothing in its construction puts more precision where the text queries need it.</w:t>
+        <w:t xml:space="preserve">, recall 0.504), which matches the shift between the two LSH curves in Figure 5. LSH suffers most because it cannot adapt: unlike PQ, nothing in its construction puts more precision where the text queries need it.</w:t>
       </w:r>
     </w:p>
     <w:p>
@@ -12885,7 +12988,15 @@
         <w:t xml:space="preserve">(P2) Distance from the data hurts HNSW.</w:t>
       </w:r>
       <w:r>
-        <w:t xml:space="preserve"> HNSW's per-query recall increases with the query's similarity to its nearest image (Spearman correlation +0.55 on COCO and +0.64 on LAION; Figure 5, left), and text queries sit at the low end. On LAION at </w:t>
+        <w:t xml:space="preserve"> Over all queries, HNSW's per-query recall increases with the query's similarity to its nearest image (Spearman correlation +0.80 on COCO and +0.71 on LAION at </w:t>
+      </w:r>
+      <m:oMath>
+        <m:r>
+          <m:t xml:space="preserve">ef</m:t>
+        </m:r>
+      </m:oMath>
+      <w:r>
+        <w:t xml:space="preserve"> = 128; Figure 6, left), and text queries sit at the low end. The trend also holds within image queries (+0.55, +0.64) and COCO text queries (+0.33), but not within LAION text queries (+0.06), which are all far from the images (0.32 to 0.39), so this single number cannot tell the easy ones from the hard ones. On LAION at </w:t>
       </w:r>
       <m:oMath>
         <m:r>
@@ -12940,165 +13051,7 @@
           <wp:inline distT="0" distB="0" distL="0" distR="0">
             <wp:extent cx="5581650" cy="2209800"/>
             <wp:effectExtent t="0" r="0" b="0" l="0"/>
-            <wp:docPr id="1" name="fig7_hnsw_build_params.png" descr="HNSW recall@100 against graph degree $M$ (left) and $efConstruction$ (right), COCO." title="Figure 6"/>
-            <wp:cNvGraphicFramePr>
-              <a:graphicFrameLocks xmlns:a="http://schemas.openxmlformats.org/drawingml/2006/main" noChangeAspect="1"/>
-            </wp:cNvGraphicFramePr>
-            <a:graphic xmlns:a="http://schemas.openxmlformats.org/drawingml/2006/main">
-              <a:graphicData uri="http://schemas.openxmlformats.org/drawingml/2006/picture">
-                <pic:pic xmlns:pic="http://schemas.openxmlformats.org/drawingml/2006/picture">
-                  <pic:nvPicPr>
-                    <pic:cNvPr id="0" name="" descr=""/>
-                    <pic:cNvPicPr>
-                      <a:picLocks noChangeAspect="1" noChangeArrowheads="1"/>
-                    </pic:cNvPicPr>
-                  </pic:nvPicPr>
-                  <pic:blipFill>
-                    <a:blip r:embed="rId13" cstate="none"/>
-                    <a:srcRect/>
-                    <a:stretch>
-                      <a:fillRect/>
-                    </a:stretch>
-                  </pic:blipFill>
-                  <pic:spPr bwMode="auto">
-                    <a:xfrm>
-                      <a:off x="0" y="0"/>
-                      <a:ext cx="5581650" cy="2209800"/>
-                    </a:xfrm>
-                    <a:prstGeom prst="rect">
-                      <a:avLst/>
-                    </a:prstGeom>
-                  </pic:spPr>
-                </pic:pic>
-              </a:graphicData>
-            </a:graphic>
-          </wp:inline>
-        </w:drawing>
-      </w:r>
-    </w:p>
-    <w:p>
-      <w:pPr>
-        <w:spacing w:after="220" w:line="240"/>
-        <w:ind w:left="360" w:right="360"/>
-        <w:jc w:val="both"/>
-      </w:pPr>
-      <w:r>
-        <w:rPr>
-          <w:b/>
-          <w:bCs/>
-          <w:sz w:val="19"/>
-          <w:szCs w:val="19"/>
-        </w:rPr>
-        <w:t xml:space="preserve">Figure 6. </w:t>
-      </w:r>
-      <w:r>
-        <w:rPr>
-          <w:sz w:val="19"/>
-          <w:szCs w:val="19"/>
-        </w:rPr>
-        <w:t xml:space="preserve">HNSW recall@100 against graph degree </w:t>
-      </w:r>
-      <m:oMath>
-        <m:r>
-          <m:t xml:space="preserve">M</m:t>
-        </m:r>
-      </m:oMath>
-      <w:r>
-        <w:rPr>
-          <w:sz w:val="19"/>
-          <w:szCs w:val="19"/>
-        </w:rPr>
-        <w:t xml:space="preserve"> (left) and </w:t>
-      </w:r>
-      <m:oMath>
-        <m:r>
-          <m:t xml:space="preserve">efConstruction</m:t>
-        </m:r>
-      </m:oMath>
-      <w:r>
-        <w:rPr>
-          <w:sz w:val="19"/>
-          <w:szCs w:val="19"/>
-        </w:rPr>
-        <w:t xml:space="preserve"> (right), COCO.</w:t>
-      </w:r>
-    </w:p>
-    <w:p>
-      <w:pPr>
-        <w:spacing w:after="120" w:line="264"/>
-        <w:jc w:val="both"/>
-      </w:pPr>
-      <w:r>
-        <w:t xml:space="preserve">More links per node reduce the gap (Figure 6). Going from </w:t>
-      </w:r>
-      <m:oMath>
-        <m:r>
-          <m:t xml:space="preserve">M=8</m:t>
-        </m:r>
-      </m:oMath>
-      <w:r>
-        <w:t xml:space="preserve"> to </w:t>
-      </w:r>
-      <m:oMath>
-        <m:r>
-          <m:t xml:space="preserve">M=64</m:t>
-        </m:r>
-      </m:oMath>
-      <w:r>
-        <w:t xml:space="preserve"> raises COCO text recall at </w:t>
-      </w:r>
-      <m:oMath>
-        <m:r>
-          <m:t xml:space="preserve">ef=100</m:t>
-        </m:r>
-      </m:oMath>
-      <w:r>
-        <w:t xml:space="preserve"> from 0.79 to 0.89 and lowers Δ from 0.155 to 0.098, at 21% more memory, and most of the gain is reached at </w:t>
-      </w:r>
-      <m:oMath>
-        <m:r>
-          <m:t xml:space="preserve">M=16</m:t>
-        </m:r>
-      </m:oMath>
-      <w:r>
-        <w:t xml:space="preserve"> to 32. </w:t>
-      </w:r>
-      <m:oMath>
-        <m:r>
-          <m:t xml:space="preserve">efConstruction</m:t>
-        </m:r>
-      </m:oMath>
-      <w:r>
-        <w:t xml:space="preserve"> has no consistent effect (text recall 0.92, 0.86, 0.88 and 0.90 for 40, 100, 200 and 400): a more careful build connects similar images better, which is not what text queries need.</w:t>
-      </w:r>
-    </w:p>
-    <w:p>
-      <w:pPr>
-        <w:keepNext/>
-        <w:spacing w:before="140" w:after="60"/>
-      </w:pPr>
-      <w:r>
-        <w:rPr>
-          <w:b/>
-          <w:bCs/>
-          <w:i/>
-          <w:iCs/>
-        </w:rPr>
-        <w:t xml:space="preserve">Database size</w:t>
-      </w:r>
-    </w:p>
-    <w:p>
-      <w:pPr>
-        <w:keepNext/>
-        <w:spacing w:before="160" w:after="60"/>
-        <w:jc w:val="center"/>
-      </w:pPr>
-      <w:r>
-        <w:drawing>
-          <wp:inline distT="0" distB="0" distL="0" distR="0">
-            <wp:extent cx="5581650" cy="2352675"/>
-            <wp:effectExtent t="0" r="0" b="0" l="0"/>
-            <wp:docPr id="1" name="fig8_scaling.png" descr="Recall@100 against database size (random LAION subsets). Left: HNSW; right: PQ." title="Figure 7"/>
+            <wp:docPr id="1" name="fig7_hnsw_build_params.png" descr="HNSW recall@100 against graph degree $M$ (left) and $efConstruction$ (right), COCO." title="Figure 7"/>
             <wp:cNvGraphicFramePr>
               <a:graphicFrameLocks xmlns:a="http://schemas.openxmlformats.org/drawingml/2006/main" noChangeAspect="1"/>
             </wp:cNvGraphicFramePr>
@@ -13121,6 +13074,164 @@
                   <pic:spPr bwMode="auto">
                     <a:xfrm>
                       <a:off x="0" y="0"/>
+                      <a:ext cx="5581650" cy="2209800"/>
+                    </a:xfrm>
+                    <a:prstGeom prst="rect">
+                      <a:avLst/>
+                    </a:prstGeom>
+                  </pic:spPr>
+                </pic:pic>
+              </a:graphicData>
+            </a:graphic>
+          </wp:inline>
+        </w:drawing>
+      </w:r>
+    </w:p>
+    <w:p>
+      <w:pPr>
+        <w:spacing w:after="220" w:line="240"/>
+        <w:ind w:left="360" w:right="360"/>
+        <w:jc w:val="both"/>
+      </w:pPr>
+      <w:r>
+        <w:rPr>
+          <w:b/>
+          <w:bCs/>
+          <w:sz w:val="19"/>
+          <w:szCs w:val="19"/>
+        </w:rPr>
+        <w:t xml:space="preserve">Figure 7. </w:t>
+      </w:r>
+      <w:r>
+        <w:rPr>
+          <w:sz w:val="19"/>
+          <w:szCs w:val="19"/>
+        </w:rPr>
+        <w:t xml:space="preserve">HNSW recall@100 against graph degree </w:t>
+      </w:r>
+      <m:oMath>
+        <m:r>
+          <m:t xml:space="preserve">M</m:t>
+        </m:r>
+      </m:oMath>
+      <w:r>
+        <w:rPr>
+          <w:sz w:val="19"/>
+          <w:szCs w:val="19"/>
+        </w:rPr>
+        <w:t xml:space="preserve"> (left) and </w:t>
+      </w:r>
+      <m:oMath>
+        <m:r>
+          <m:t xml:space="preserve">efConstruction</m:t>
+        </m:r>
+      </m:oMath>
+      <w:r>
+        <w:rPr>
+          <w:sz w:val="19"/>
+          <w:szCs w:val="19"/>
+        </w:rPr>
+        <w:t xml:space="preserve"> (right), COCO.</w:t>
+      </w:r>
+    </w:p>
+    <w:p>
+      <w:pPr>
+        <w:spacing w:after="120" w:line="264"/>
+        <w:jc w:val="both"/>
+      </w:pPr>
+      <w:r>
+        <w:t xml:space="preserve">More links per node reduce the gap (Figure 7). Going from </w:t>
+      </w:r>
+      <m:oMath>
+        <m:r>
+          <m:t xml:space="preserve">M=8</m:t>
+        </m:r>
+      </m:oMath>
+      <w:r>
+        <w:t xml:space="preserve"> to </w:t>
+      </w:r>
+      <m:oMath>
+        <m:r>
+          <m:t xml:space="preserve">M=64</m:t>
+        </m:r>
+      </m:oMath>
+      <w:r>
+        <w:t xml:space="preserve"> raises COCO text recall at </w:t>
+      </w:r>
+      <m:oMath>
+        <m:r>
+          <m:t xml:space="preserve">ef=100</m:t>
+        </m:r>
+      </m:oMath>
+      <w:r>
+        <w:t xml:space="preserve"> from 0.79 to 0.89 and lowers Δ from 0.155 to 0.098, at 21% more memory, and most of the gain is reached at </w:t>
+      </w:r>
+      <m:oMath>
+        <m:r>
+          <m:t xml:space="preserve">M=16</m:t>
+        </m:r>
+      </m:oMath>
+      <w:r>
+        <w:t xml:space="preserve"> to 32. </w:t>
+      </w:r>
+      <m:oMath>
+        <m:r>
+          <m:t xml:space="preserve">efConstruction</m:t>
+        </m:r>
+      </m:oMath>
+      <w:r>
+        <w:t xml:space="preserve"> has no consistent effect (text recall 0.92, 0.86, 0.88 and 0.90 for 40, 100, 200 and 400): a more careful build connects similar images better, which is not what text queries need.</w:t>
+      </w:r>
+    </w:p>
+    <w:p>
+      <w:pPr>
+        <w:keepNext/>
+        <w:spacing w:before="140" w:after="60"/>
+      </w:pPr>
+      <w:r>
+        <w:rPr>
+          <w:b/>
+          <w:bCs/>
+          <w:i/>
+          <w:iCs/>
+        </w:rPr>
+        <w:t xml:space="preserve">Database size</w:t>
+      </w:r>
+    </w:p>
+    <w:p>
+      <w:pPr>
+        <w:keepNext/>
+        <w:spacing w:before="160" w:after="60"/>
+        <w:jc w:val="center"/>
+      </w:pPr>
+      <w:r>
+        <w:drawing>
+          <wp:inline distT="0" distB="0" distL="0" distR="0">
+            <wp:extent cx="5581650" cy="2352675"/>
+            <wp:effectExtent t="0" r="0" b="0" l="0"/>
+            <wp:docPr id="1" name="fig8_scaling.png" descr="Recall@100 against database size (random LAION subsets). Left: HNSW; right: PQ." title="Figure 8"/>
+            <wp:cNvGraphicFramePr>
+              <a:graphicFrameLocks xmlns:a="http://schemas.openxmlformats.org/drawingml/2006/main" noChangeAspect="1"/>
+            </wp:cNvGraphicFramePr>
+            <a:graphic xmlns:a="http://schemas.openxmlformats.org/drawingml/2006/main">
+              <a:graphicData uri="http://schemas.openxmlformats.org/drawingml/2006/picture">
+                <pic:pic xmlns:pic="http://schemas.openxmlformats.org/drawingml/2006/picture">
+                  <pic:nvPicPr>
+                    <pic:cNvPr id="0" name="" descr=""/>
+                    <pic:cNvPicPr>
+                      <a:picLocks noChangeAspect="1" noChangeArrowheads="1"/>
+                    </pic:cNvPicPr>
+                  </pic:nvPicPr>
+                  <pic:blipFill>
+                    <a:blip r:embed="rId15" cstate="none"/>
+                    <a:srcRect/>
+                    <a:stretch>
+                      <a:fillRect/>
+                    </a:stretch>
+                  </pic:blipFill>
+                  <pic:spPr bwMode="auto">
+                    <a:xfrm>
+                      <a:off x="0" y="0"/>
                       <a:ext cx="5581650" cy="2352675"/>
                     </a:xfrm>
                     <a:prstGeom prst="rect">
@@ -13147,7 +13258,7 @@
           <w:sz w:val="19"/>
           <w:szCs w:val="19"/>
         </w:rPr>
-        <w:t xml:space="preserve">Figure 7. </w:t>
+        <w:t xml:space="preserve">Figure 8. </w:t>
       </w:r>
       <w:r>
         <w:rPr>
@@ -13163,7 +13274,7 @@
         <w:jc w:val="both"/>
       </w:pPr>
       <w:r>
-        <w:t xml:space="preserve">Using random LAION subsets with recomputed ground truth (Figure 7), HNSW's gap at </w:t>
+        <w:t xml:space="preserve">Using random LAION subsets with recomputed ground truth (Figure 8), HNSW's gap at </w:t>
       </w:r>
       <m:oMath>
         <m:r>
@@ -13171,7 +13282,15 @@
         </m:r>
       </m:oMath>
       <w:r>
-        <w:t xml:space="preserve"> grows from 0.10 at 10k images to 0.13 at 100k and 0.19 at 1M, as (P2) predicts: a longer search path has more chances to stop in the wrong place. PQ's gap stays at 0.10 to 0.12 at every size.</w:t>
+        <w:t xml:space="preserve"> grows from 0.10 at 10k images to 0.13 at 100k and 0.19 at 1M, as (P2) predicts: a longer search path has more chances to stop in the wrong place. PQ's gap at </w:t>
+      </w:r>
+      <m:oMath>
+        <m:r>
+          <m:t xml:space="preserve">M</m:t>
+        </m:r>
+      </m:oMath>
+      <w:r>
+        <w:t xml:space="preserve"> = 64 stays at 0.10 to 0.12 at every size.</w:t>
       </w:r>
     </w:p>
     <w:p>
@@ -15334,7 +15453,7 @@
           <wp:inline distT="0" distB="0" distL="0" distR="0">
             <wp:extent cx="5581650" cy="2819400"/>
             <wp:effectExtent t="0" r="0" b="0" l="0"/>
-            <wp:docPr id="1" name="fig9_hnsw_fixes.png" descr="HNSW variants: recall@100 against QPS (dashed: text queries). Purple: caption-guided edges (lighter shades use fewer training captions); green: caption entry points." title="Figure 8"/>
+            <wp:docPr id="1" name="fig9_hnsw_fixes.png" descr="HNSW variants: recall@100 against QPS (dashed: text queries). Purple: caption-guided edges (lighter shades use fewer training captions); green: caption entry points." title="Figure 9"/>
             <wp:cNvGraphicFramePr>
               <a:graphicFrameLocks xmlns:a="http://schemas.openxmlformats.org/drawingml/2006/main" noChangeAspect="1"/>
             </wp:cNvGraphicFramePr>
@@ -15348,7 +15467,7 @@
                     </pic:cNvPicPr>
                   </pic:nvPicPr>
                   <pic:blipFill>
-                    <a:blip r:embed="rId15" cstate="none"/>
+                    <a:blip r:embed="rId16" cstate="none"/>
                     <a:srcRect/>
                     <a:stretch>
                       <a:fillRect/>
@@ -15383,7 +15502,7 @@
           <w:sz w:val="19"/>
           <w:szCs w:val="19"/>
         </w:rPr>
-        <w:t xml:space="preserve">Figure 8. </w:t>
+        <w:t xml:space="preserve">Figure 9. </w:t>
       </w:r>
       <w:r>
         <w:rPr>
@@ -15399,7 +15518,7 @@
         <w:jc w:val="both"/>
       </w:pPr>
       <w:r>
-        <w:t xml:space="preserve">Better entry points (variant 1) do not help, so the problem is not where the search starts. Captions as nodes (variant 2) make things much worse: a caption node is far more similar to a text query (about 0.8) than any image is (about 0.3), so caption nodes fill the whole candidate list and the search never reaches the images. Caption-guided edges (variant 3) work (Table 9, Figure 8). On COCO, text recall rises from 0.88 to 0.95, Δ drops by 60%, and image recall also rises slightly. At equal recall the modified graph is 1.5 times faster (text recall 0.947 at 2,170 QPS against 0.948 at 1,470 QPS). On LAION, text recall improves by 7 points at </w:t>
+        <w:t xml:space="preserve">Better entry points (variant 1) do not help, so the problem is not where the search starts. Captions as nodes (variant 2) make things much worse: a caption node is far more similar to a text query (about 0.8) than any image is (about 0.3), so caption nodes fill the whole candidate list and the search never reaches the images. Caption-guided edges (variant 3) work (Table 9, Figure 9). On COCO, text recall rises from 0.88 to 0.95, Δ drops by 60%, and image recall also rises slightly. At equal recall the modified graph is 1.5 times faster (text recall 0.947 at 2,170 QPS against 0.948 at 1,470 QPS). On LAION, text recall improves by 7 points at </w:t>
       </w:r>
       <m:oMath>
         <m:r>
@@ -16956,133 +17075,7 @@
           <wp:inline distT="0" distB="0" distL="0" distR="0">
             <wp:extent cx="5581650" cy="3667125"/>
             <wp:effectExtent t="0" r="0" b="0" l="0"/>
-            <wp:docPr id="1" name="fig10_pq_fixes.png" descr="PQ variants: recall@100 against code size, for image queries (top) and text queries (bottom)." title="Figure 9"/>
-            <wp:cNvGraphicFramePr>
-              <a:graphicFrameLocks xmlns:a="http://schemas.openxmlformats.org/drawingml/2006/main" noChangeAspect="1"/>
-            </wp:cNvGraphicFramePr>
-            <a:graphic xmlns:a="http://schemas.openxmlformats.org/drawingml/2006/main">
-              <a:graphicData uri="http://schemas.openxmlformats.org/drawingml/2006/picture">
-                <pic:pic xmlns:pic="http://schemas.openxmlformats.org/drawingml/2006/picture">
-                  <pic:nvPicPr>
-                    <pic:cNvPr id="0" name="" descr=""/>
-                    <pic:cNvPicPr>
-                      <a:picLocks noChangeAspect="1" noChangeArrowheads="1"/>
-                    </pic:cNvPicPr>
-                  </pic:nvPicPr>
-                  <pic:blipFill>
-                    <a:blip r:embed="rId16" cstate="none"/>
-                    <a:srcRect/>
-                    <a:stretch>
-                      <a:fillRect/>
-                    </a:stretch>
-                  </pic:blipFill>
-                  <pic:spPr bwMode="auto">
-                    <a:xfrm>
-                      <a:off x="0" y="0"/>
-                      <a:ext cx="5581650" cy="3667125"/>
-                    </a:xfrm>
-                    <a:prstGeom prst="rect">
-                      <a:avLst/>
-                    </a:prstGeom>
-                  </pic:spPr>
-                </pic:pic>
-              </a:graphicData>
-            </a:graphic>
-          </wp:inline>
-        </w:drawing>
-      </w:r>
-    </w:p>
-    <w:p>
-      <w:pPr>
-        <w:spacing w:after="220" w:line="240"/>
-        <w:ind w:left="360" w:right="360"/>
-        <w:jc w:val="both"/>
-      </w:pPr>
-      <w:r>
-        <w:rPr>
-          <w:b/>
-          <w:bCs/>
-          <w:sz w:val="19"/>
-          <w:szCs w:val="19"/>
-        </w:rPr>
-        <w:t xml:space="preserve">Figure 9. </w:t>
-      </w:r>
-      <w:r>
-        <w:rPr>
-          <w:sz w:val="19"/>
-          <w:szCs w:val="19"/>
-        </w:rPr>
-        <w:t xml:space="preserve">PQ variants: recall@100 against code size, for image queries (top) and text queries (bottom).</w:t>
-      </w:r>
-    </w:p>
-    <w:p>
-      <w:pPr>
-        <w:spacing w:after="120" w:line="264"/>
-        <w:jc w:val="both"/>
-      </w:pPr>
-      <w:r>
-        <w:t xml:space="preserve">The OPQ rotation is necessary (Table 10, Figure 9). Weighting alone puts most of the variance into a few directions, which a fixed split into sub-vectors handles badly, and image recall falls to 0.12 to 0.16. With the rotation, text weighting raises COCO text recall from 0.51 to 0.79 at the same 64 bytes, and on LAION it removes the gap at every code size. If both query types matter, mixed weighting is the better choice: on COCO it gives the best image recall, the second-best text recall, and halves Δ. The ratio </w:t>
-      </w:r>
-      <m:oMath>
-        <m:r>
-          <m:t xml:space="preserve">ρ</m:t>
-        </m:r>
-      </m:oMath>
-      <w:r>
-        <w:t xml:space="preserve"> ranks the variants in almost the same order as recall, which supports Section 2.6: what raises recall is a lower score error relative to the contrast, not a lower reconstruction error.</w:t>
-      </w:r>
-    </w:p>
-    <w:p>
-      <w:pPr>
-        <w:spacing w:after="120" w:line="264"/>
-        <w:jc w:val="both"/>
-      </w:pPr>
-      <w:r>
-        <w:rPr>
-          <w:b/>
-          <w:bCs/>
-        </w:rPr>
-        <w:t xml:space="preserve">Re-ranking.</w:t>
-      </w:r>
-      <w:r>
-        <w:t xml:space="preserve"> Re-scoring PQ's top 1,000 candidates with the full vectors (at most 21% slower) raises recall at </w:t>
-      </w:r>
-      <m:oMath>
-        <m:r>
-          <m:t xml:space="preserve">M</m:t>
-        </m:r>
-      </m:oMath>
-      <w:r>
-        <w:t xml:space="preserve"> = 64 to 0.998 / 0.974 on COCO and 0.968 / 0.895 on LAION. But it needs the full vectors in memory or on disk, which removes PQ's memory advantage, and it cannot recover neighbours missing from the candidate list. Better codes and re-ranking therefore work well together.</w:t>
-      </w:r>
-    </w:p>
-    <w:p>
-      <w:pPr>
-        <w:keepNext/>
-        <w:spacing w:before="140" w:after="60"/>
-      </w:pPr>
-      <w:r>
-        <w:rPr>
-          <w:b/>
-          <w:bCs/>
-          <w:i/>
-          <w:iCs/>
-        </w:rPr>
-        <w:t xml:space="preserve">Modality-aware LSH</w:t>
-      </w:r>
-    </w:p>
-    <w:p>
-      <w:pPr>
-        <w:keepNext/>
-        <w:spacing w:before="160" w:after="60"/>
-        <w:jc w:val="center"/>
-      </w:pPr>
-      <w:r>
-        <w:drawing>
-          <wp:inline distT="0" distB="0" distL="0" distR="0">
-            <wp:extent cx="5581650" cy="1924050"/>
-            <wp:effectExtent t="0" r="0" b="0" l="0"/>
-            <wp:docPr id="1" name="fig11_lsh_variants.png" descr="LSH variants: text-query recall@100 against code length. Median thresholds and image-mean centring overlap." title="Figure 10"/>
+            <wp:docPr id="1" name="fig10_pq_fixes.png" descr="PQ variants: recall@100 against code size, for image queries (top) and text queries (bottom)." title="Figure 10"/>
             <wp:cNvGraphicFramePr>
               <a:graphicFrameLocks xmlns:a="http://schemas.openxmlformats.org/drawingml/2006/main" noChangeAspect="1"/>
             </wp:cNvGraphicFramePr>
@@ -17105,7 +17098,7 @@
                   <pic:spPr bwMode="auto">
                     <a:xfrm>
                       <a:off x="0" y="0"/>
-                      <a:ext cx="5581650" cy="1924050"/>
+                      <a:ext cx="5581650" cy="3667125"/>
                     </a:xfrm>
                     <a:prstGeom prst="rect">
                       <a:avLst/>
@@ -17138,7 +17131,7 @@
           <w:sz w:val="19"/>
           <w:szCs w:val="19"/>
         </w:rPr>
-        <w:t xml:space="preserve">LSH variants: text-query recall@100 against code length. Median thresholds and image-mean centring overlap.</w:t>
+        <w:t xml:space="preserve">PQ variants: recall@100 against code size, for image queries (top) and text queries (bottom).</w:t>
       </w:r>
     </w:p>
     <w:p>
@@ -17147,15 +17140,54 @@
         <w:jc w:val="both"/>
       </w:pPr>
       <w:r>
-        <w:t xml:space="preserve">Figure 10 shows text queries only, since image queries are hashed the same way in all centred variants. The two image-based fixes, median thresholds and image-mean centring, make text recall much worse: at 4,096 bits it falls from 0.56 to 0.22 on COCO and from 0.52 to 0.07 on LAION, because a text query lands on the same side of most hyperplanes, as predicted in Section 2.7. Modality-aware centring (Eq. 9) fixes this and beats plain LSH. Text recall roughly doubles at medium code lengths (COCO, 512 bits: 0.18 to 0.33; LAION, 1,024 bits: 0.23 to 0.40), and the LAION gap at 4,096 bits falls from 0.29 to 0.12.</w:t>
+        <w:t xml:space="preserve">The OPQ rotation is necessary (Table 10, Figure 10). Weighting alone puts most of the variance into a few directions, which a fixed split into sub-vectors handles badly, and image recall falls to 0.12 to 0.16. With the rotation, text weighting raises COCO text recall from 0.51 to 0.79 at the same 64 bytes, and on LAION it removes the gap at every code size. If both query types matter, mixed weighting is the better choice: on COCO it gives the best image recall, the second-best text recall, and halves Δ. The ratio </w:t>
+      </w:r>
+      <m:oMath>
+        <m:r>
+          <m:t xml:space="preserve">ρ</m:t>
+        </m:r>
+      </m:oMath>
+      <w:r>
+        <w:t xml:space="preserve"> ranks the variants in almost the same order as recall, which supports Section 2.6: what raises recall is a lower score error relative to the contrast, not a lower reconstruction error.</w:t>
       </w:r>
     </w:p>
     <w:p>
       <w:pPr>
-        <w:pStyle w:val="Heading2"/>
+        <w:spacing w:after="120" w:line="264"/>
+        <w:jc w:val="both"/>
       </w:pPr>
       <w:r>
-        <w:t xml:space="preserve">3.8 Success and failure cases</w:t>
+        <w:rPr>
+          <w:b/>
+          <w:bCs/>
+        </w:rPr>
+        <w:t xml:space="preserve">Re-ranking.</w:t>
+      </w:r>
+      <w:r>
+        <w:t xml:space="preserve"> Re-scoring PQ's top 1,000 candidates with the full vectors (at most 21% slower) raises recall at </w:t>
+      </w:r>
+      <m:oMath>
+        <m:r>
+          <m:t xml:space="preserve">M</m:t>
+        </m:r>
+      </m:oMath>
+      <w:r>
+        <w:t xml:space="preserve"> = 64 to 0.998 / 0.974 on COCO and 0.968 / 0.895 on LAION. But it needs the full vectors in memory or on disk, which removes PQ's memory advantage, and it cannot recover neighbours missing from the candidate list. Better codes and re-ranking therefore work well together.</w:t>
+      </w:r>
+    </w:p>
+    <w:p>
+      <w:pPr>
+        <w:keepNext/>
+        <w:spacing w:before="140" w:after="60"/>
+      </w:pPr>
+      <w:r>
+        <w:rPr>
+          <w:b/>
+          <w:bCs/>
+          <w:i/>
+          <w:iCs/>
+        </w:rPr>
+        <w:t xml:space="preserve">Modality-aware LSH</w:t>
       </w:r>
     </w:p>
     <w:p>
@@ -17167,9 +17199,9 @@
       <w:r>
         <w:drawing>
           <wp:inline distT="0" distB="0" distL="0" distR="0">
-            <wp:extent cx="5581650" cy="4076700"/>
+            <wp:extent cx="5581650" cy="1924050"/>
             <wp:effectExtent t="0" r="0" b="0" l="0"/>
-            <wp:docPr id="1" name="fig12_examples.png" descr="Three COCO test captions. Rows: exact top-10, HNSW ($ef$ = 100), HNSW with caption-guided edges, PQ ($M$ = 64). Green border: in the exact top-10; red: not." title="Figure 11"/>
+            <wp:docPr id="1" name="fig11_lsh_variants.png" descr="LSH variants: text-query recall@100 against code length. Median thresholds and image-mean centring overlap." title="Figure 11"/>
             <wp:cNvGraphicFramePr>
               <a:graphicFrameLocks xmlns:a="http://schemas.openxmlformats.org/drawingml/2006/main" noChangeAspect="1"/>
             </wp:cNvGraphicFramePr>
@@ -17192,6 +17224,93 @@
                   <pic:spPr bwMode="auto">
                     <a:xfrm>
                       <a:off x="0" y="0"/>
+                      <a:ext cx="5581650" cy="1924050"/>
+                    </a:xfrm>
+                    <a:prstGeom prst="rect">
+                      <a:avLst/>
+                    </a:prstGeom>
+                  </pic:spPr>
+                </pic:pic>
+              </a:graphicData>
+            </a:graphic>
+          </wp:inline>
+        </w:drawing>
+      </w:r>
+    </w:p>
+    <w:p>
+      <w:pPr>
+        <w:spacing w:after="220" w:line="240"/>
+        <w:ind w:left="360" w:right="360"/>
+        <w:jc w:val="both"/>
+      </w:pPr>
+      <w:r>
+        <w:rPr>
+          <w:b/>
+          <w:bCs/>
+          <w:sz w:val="19"/>
+          <w:szCs w:val="19"/>
+        </w:rPr>
+        <w:t xml:space="preserve">Figure 11. </w:t>
+      </w:r>
+      <w:r>
+        <w:rPr>
+          <w:sz w:val="19"/>
+          <w:szCs w:val="19"/>
+        </w:rPr>
+        <w:t xml:space="preserve">LSH variants: text-query recall@100 against code length. Median thresholds and image-mean centring overlap.</w:t>
+      </w:r>
+    </w:p>
+    <w:p>
+      <w:pPr>
+        <w:spacing w:after="120" w:line="264"/>
+        <w:jc w:val="both"/>
+      </w:pPr>
+      <w:r>
+        <w:t xml:space="preserve">Figure 11 shows text queries only, since image queries are hashed the same way in all centred variants. The two image-based fixes, median thresholds and image-mean centring, make text recall much worse: at 4,096 bits it falls from 0.56 to 0.22 on COCO and from 0.52 to 0.07 on LAION, because a text query lands on the same side of most hyperplanes, as predicted in Section 2.7. Modality-aware centring (Eq. 9) fixes this and beats plain LSH. Text recall roughly doubles at medium code lengths (COCO, 512 bits: 0.18 to 0.33; LAION, 1,024 bits: 0.23 to 0.40), and the LAION gap at 4,096 bits falls from 0.29 to 0.12.</w:t>
+      </w:r>
+    </w:p>
+    <w:p>
+      <w:pPr>
+        <w:pStyle w:val="Heading2"/>
+      </w:pPr>
+      <w:r>
+        <w:t xml:space="preserve">3.8 Success and failure cases</w:t>
+      </w:r>
+    </w:p>
+    <w:p>
+      <w:pPr>
+        <w:keepNext/>
+        <w:spacing w:before="160" w:after="60"/>
+        <w:jc w:val="center"/>
+      </w:pPr>
+      <w:r>
+        <w:drawing>
+          <wp:inline distT="0" distB="0" distL="0" distR="0">
+            <wp:extent cx="5581650" cy="4076700"/>
+            <wp:effectExtent t="0" r="0" b="0" l="0"/>
+            <wp:docPr id="1" name="fig12_examples.png" descr="Three COCO test captions. Rows: exact top-10, HNSW ($ef$ = 100), HNSW with caption-guided edges, PQ ($M$ = 64). Green border: in the exact top-10; red: not." title="Figure 12"/>
+            <wp:cNvGraphicFramePr>
+              <a:graphicFrameLocks xmlns:a="http://schemas.openxmlformats.org/drawingml/2006/main" noChangeAspect="1"/>
+            </wp:cNvGraphicFramePr>
+            <a:graphic xmlns:a="http://schemas.openxmlformats.org/drawingml/2006/main">
+              <a:graphicData uri="http://schemas.openxmlformats.org/drawingml/2006/picture">
+                <pic:pic xmlns:pic="http://schemas.openxmlformats.org/drawingml/2006/picture">
+                  <pic:nvPicPr>
+                    <pic:cNvPr id="0" name="" descr=""/>
+                    <pic:cNvPicPr>
+                      <a:picLocks noChangeAspect="1" noChangeArrowheads="1"/>
+                    </pic:cNvPicPr>
+                  </pic:nvPicPr>
+                  <pic:blipFill>
+                    <a:blip r:embed="rId19" cstate="none"/>
+                    <a:srcRect/>
+                    <a:stretch>
+                      <a:fillRect/>
+                    </a:stretch>
+                  </pic:blipFill>
+                  <pic:spPr bwMode="auto">
+                    <a:xfrm>
+                      <a:off x="0" y="0"/>
                       <a:ext cx="5581650" cy="4076700"/>
                     </a:xfrm>
                     <a:prstGeom prst="rect">
@@ -17218,7 +17337,7 @@
           <w:sz w:val="19"/>
           <w:szCs w:val="19"/>
         </w:rPr>
-        <w:t xml:space="preserve">Figure 11. </w:t>
+        <w:t xml:space="preserve">Figure 12. </w:t>
       </w:r>
       <w:r>
         <w:rPr>
@@ -17258,7 +17377,7 @@
         <w:jc w:val="both"/>
       </w:pPr>
       <w:r>
-        <w:t xml:space="preserve">Figure 11 shows three COCO captions chosen to show the two kinds of failure. For the long caption about a train, HNSW gets stuck in a nearby region and drifts to lorries and car parks (recall@10 = 0.5), while the graph with caption-guided edges returns exactly the true top-10. For the baseball caption, PQ finds the right topic but the wrong order: every result is a reasonable baseball photo, but none is in the exact top-10, because hundreds of images have almost the same score and small errors reshuffle them. A user might still be happy with these results, which is a limitation of measuring recall against linear search. Over all captions, HNSW usually succeeds (text recall@10 of 0.949, and 0.987 with caption-guided edges).</w:t>
+        <w:t xml:space="preserve">Figure 12 shows three COCO captions chosen to show the two kinds of failure. For the long caption about a train, HNSW gets stuck in a nearby region and drifts to lorries and car parks (recall@10 = 0.5), while the graph with caption-guided edges returns exactly the true top-10. For the baseball caption, PQ finds the right topic but the wrong order: every result is a reasonable baseball photo, but none is in the exact top-10, because hundreds of images have almost the same score and small errors reshuffle them. A user might still be happy with these results, which is a limitation of measuring recall against linear search. Over all captions, HNSW usually succeeds (text recall@10 of 0.949, and 0.987 with caption-guided edges).</w:t>
       </w:r>
     </w:p>
     <w:p>
@@ -17949,7 +18068,7 @@
         <w:t xml:space="preserve">Limitations.</w:t>
       </w:r>
       <w:r>
-        <w:t xml:space="preserve"> We use only one encoder (CLIP ViT-B/32); newer encoders may have a smaller modality gap. Timing is single-threaded on CPU, and independent jobs shared one server, which may lower absolute QPS but does not affect recall. Recall is measured against linear search, not human judgement (Figure 11). The improved methods need training captions from the same distribution as the real queries, and we did not test what happens when they differ.</w:t>
+        <w:t xml:space="preserve"> We use only one encoder (CLIP ViT-B/32); newer encoders may have a smaller modality gap. Timing is single-threaded on CPU, and independent jobs shared one server, which may lower absolute QPS but does not affect recall. Recall is measured against linear search, not human judgement (Figure 12). The improved methods need training captions from the same distribution as the real queries, and we did not test what happens when they differ.</w:t>
       </w:r>
     </w:p>
     <w:p>

</xml_diff>

<commit_message>
Report: explain terms and symbols for readers with little context
</commit_message>
<xml_diff>
--- a/report/group_21_report.docx
+++ b/report/group_21_report.docx
@@ -140,7 +140,7 @@
           <w:sz w:val="22"/>
           <w:szCs w:val="22"/>
         </w:rPr>
-        <w:t xml:space="preserve">Text-to-image search engines turn captions and images into vectors with CLIP and then search the image vectors with an approximate nearest neighbour (ANN) method. The index is built from images, but the queries are captions, and CLIP places text and image vectors in different regions of the space (the </w:t>
+        <w:t xml:space="preserve">Text-to-image search engines turn captions and images into vectors with an embedding model such as CLIP, and then search the image vectors with an approximate nearest neighbour (ANN) method, which builds a search structure (an index) for fast lookup. The index is built from images, but the queries are captions, and CLIP places text and image vectors in different regions of the space (the </w:t>
       </w:r>
       <w:r>
         <w:rPr>
@@ -197,7 +197,15 @@
         </m:r>
       </m:oMath>
       <w:r>
-        <w:t xml:space="preserve"> similarity calculations, which is slow for large databases. On our LAION database of one million images, one linear search takes 104 ms on a single thread. Approximate nearest neighbour (ANN) methods such as LSH and PQ return approximate results in exchange for much faster search or much less memory.</w:t>
+        <w:t xml:space="preserve"> similarity calculations, which is slow for large databases. On our LAION database of one million images, one linear search takes 104 ms on a single thread. Approximate nearest neighbour (ANN) methods such as LSH and PQ build a data structure, called an index, from the database in advance. At query time they return almost the same top-</w:t>
+      </w:r>
+      <m:oMath>
+        <m:r>
+          <m:t xml:space="preserve">k</m:t>
+        </m:r>
+      </m:oMath>
+      <w:r>
+        <w:t xml:space="preserve"> as linear search, but much faster or using much less memory. The goal of an ANN method is therefore to stay as close as possible to the linear search result while saving time or memory.</w:t>
       </w:r>
     </w:p>
     <w:p>
@@ -206,7 +214,7 @@
         <w:jc w:val="both"/>
       </w:pPr>
       <w:r>
-        <w:t xml:space="preserve">Models such as CLIP (Radford et al., 2021) map images and text into the same 512-dimensional space, so the same ANN methods can be used to find images with a caption (</w:t>
+        <w:t xml:space="preserve">Embedding models such as CLIP (Radford et al., 2021), which is trained on image–caption pairs, map images and text into the same 512-dimensional space, so the same ANN methods can be used to find images with a caption (</w:t>
       </w:r>
       <w:r>
         <w:rPr>
@@ -216,7 +224,17 @@
         <w:t xml:space="preserve">cross-modal</w:t>
       </w:r>
       <w:r>
-        <w:t xml:space="preserve"> search). However, the two modalities do not overlap in this space. Each one sits in its own narrow cone, and the two cones are far apart (Liang et al., 2022). In our data, a caption and its own image have a cosine similarity of only about 0.3. So an index built from images receives queries from a region it has never seen. The VIBE benchmark (Jääsaari et al., 2026) shows that ANN methods become much slower on such out-of-distribution (OOD) queries, and graph methods such as RoarGraph (Chen et al., 2024) and OOD-DiskANN (Jaiswal et al., 2022) use training queries to handle them. We study the problem across three different ANN families. As a baseline, we also search each index with image queries. These come from the same distribution as the database (in-distribution), as in standard ANN benchmarks. Comparing them with text queries on the same index shows how much recall is lost only because the query is text.</w:t>
+        <w:t xml:space="preserve"> search). However, the two modalities do not overlap in this space. Each one sits in its own narrow cone, and the two cones are far apart (Liang et al., 2022). In our data, a caption and its own image have a cosine similarity of only about 0.3, while an image and its most similar other image score about 0.85. So an index built from images receives queries from a region it has never seen. This </w:t>
+      </w:r>
+      <w:r>
+        <w:rPr>
+          <w:i/>
+          <w:iCs/>
+        </w:rPr>
+        <w:t xml:space="preserve">modality gap</w:t>
+      </w:r>
+      <w:r>
+        <w:t xml:space="preserve"> comes from the embedding model, not from the index; the index only inherits it. Queries that come from a different distribution than the database are called out-of-distribution (OOD). The VIBE benchmark (Jääsaari et al., 2026) shows that ANN methods become much slower on OOD queries, and two graph methods, RoarGraph (Chen et al., 2024) and OOD-DiskANN (Jaiswal et al., 2022), use a sample of past queries to handle them. We study the problem across three different ANN families. As a baseline, we also search each index with image queries. These come from the same distribution as the database (in-distribution), as in standard ANN benchmarks. Comparing them with text queries on the same index shows how much recall is lost only because the query is text.</w:t>
       </w:r>
     </w:p>
     <w:p>
@@ -565,7 +583,7 @@
         </m:r>
       </m:oMath>
       <w:r>
-        <w:t xml:space="preserve">, which we compare with the exact list from linear search:</w:t>
+        <w:t xml:space="preserve">, which we compare with the exact list from linear search. In words, recall@100 = 0.9 means the method found 90 of the true 100 most similar images:</w:t>
       </w:r>
     </w:p>
     <w:p>
@@ -693,7 +711,7 @@
         </m:r>
       </m:oMath>
       <w:r>
-        <w:t xml:space="preserve"> is the set of queries. Recall measures how close the ANN result is to linear search, not whether a user finds the images relevant. To measure the modality gap we use </w:t>
+        <w:t xml:space="preserve"> is the set of queries. Recall measures how close the ANN result is to linear search, not whether a user finds the images relevant. Whether CLIP itself returns the right images is a property of the embedding model, which is the same for all methods, so we leave it out. To measure the modality gap we use </w:t>
       </w:r>
       <m:oMath>
         <m:r>
@@ -2016,7 +2034,25 @@
         </m:r>
       </m:oMath>
       <w:r>
-        <w:t xml:space="preserve">. The whole database is converted into binary vectors once (offline), and at query time only the query is converted (online). We then run linear search on the binary vectors using the Hamming distance, which only needs an XOR and a bit count, so it is much cheaper than a distance on float values. A 512-bit binary vector takes 64 bytes, 32 times less than the 2,048-byte float vector. We use LSH + linear search, implemented with IndexLSH from the FAISS library (Douze et al., 2024), instead of hash tables because it returns a full top-100 list. Results are averaged over three random seeds (standard deviation of recall below 0.01).</w:t>
+        <w:t xml:space="preserve">. The whole database is converted into binary vectors once (offline), and at query time only the query is converted (online). We then run linear search on the binary vectors using the Hamming distance </w:t>
+      </w:r>
+      <m:oMath>
+        <m:sSub>
+          <m:sSubPr/>
+          <m:e>
+            <m:r>
+              <m:t xml:space="preserve">D</m:t>
+            </m:r>
+          </m:e>
+          <m:sub>
+            <m:r>
+              <m:t xml:space="preserve">H</m:t>
+            </m:r>
+          </m:sub>
+        </m:sSub>
+      </m:oMath>
+      <w:r>
+        <w:t xml:space="preserve"> (the number of bits that differ), which only needs an XOR and a bit count, so it is much cheaper than a distance on float values. A 512-bit binary vector takes 64 bytes, 32 times less than the 2,048-byte float vector. We use LSH + linear search, implemented with IndexLSH from the FAISS library (Douze et al., 2024), instead of hash tables because it returns a full top-100 list. Results are averaged over three random seeds (standard deviation of recall below 0.01).</w:t>
       </w:r>
     </w:p>
     <w:p>
@@ -2032,7 +2068,31 @@
         <w:t xml:space="preserve">Why more bits give better results.</w:t>
       </w:r>
       <w:r>
-        <w:t xml:space="preserve"> A random hyperplane separates two vectors with a probability equal to the angle between them divided by </w:t>
+        <w:t xml:space="preserve"> Let </w:t>
+      </w:r>
+      <m:oMath>
+        <m:r>
+          <m:t xml:space="preserve">θ(q,x)</m:t>
+        </m:r>
+      </m:oMath>
+      <w:r>
+        <w:t xml:space="preserve"> be the angle between </w:t>
+      </w:r>
+      <m:oMath>
+        <m:r>
+          <m:t xml:space="preserve">q</m:t>
+        </m:r>
+      </m:oMath>
+      <w:r>
+        <w:t xml:space="preserve"> and </w:t>
+      </w:r>
+      <m:oMath>
+        <m:r>
+          <m:t xml:space="preserve">x</m:t>
+        </m:r>
+      </m:oMath>
+      <w:r>
+        <w:t xml:space="preserve"> (a smaller angle means more similar). A random hyperplane separates two vectors with a probability equal to this angle divided by </w:t>
       </w:r>
       <m:oMath>
         <m:r>
@@ -2166,25 +2226,7 @@
         <w:jc w:val="both"/>
       </w:pPr>
       <w:r>
-        <w:t xml:space="preserve">So the Hamming distance </w:t>
-      </w:r>
-      <m:oMath>
-        <m:sSub>
-          <m:sSubPr/>
-          <m:e>
-            <m:r>
-              <m:t xml:space="preserve">D</m:t>
-            </m:r>
-          </m:e>
-          <m:sub>
-            <m:r>
-              <m:t xml:space="preserve">H</m:t>
-            </m:r>
-          </m:sub>
-        </m:sSub>
-      </m:oMath>
-      <w:r>
-        <w:t xml:space="preserve"> estimates the angle, and the estimate gets more accurate as </w:t>
+        <w:t xml:space="preserve">So the Hamming distance estimates the angle, and the estimate gets more accurate as </w:t>
       </w:r>
       <m:oMath>
         <m:r>
@@ -2310,7 +2352,15 @@
         </m:r>
       </m:oMath>
       <w:r>
-        <w:t xml:space="preserve"> is the standard normal CDF. Since </w:t>
+        <w:t xml:space="preserve"> is the standard normal CDF. In words: LSH mixes up two images when their angles to the query are too close for </w:t>
+      </w:r>
+      <m:oMath>
+        <m:r>
+          <m:t xml:space="preserve">b</m:t>
+        </m:r>
+      </m:oMath>
+      <w:r>
+        <w:t xml:space="preserve"> random bits to tell apart. Since </w:t>
       </w:r>
       <m:oMath>
         <m:r>
@@ -2784,7 +2834,7 @@
         </m:d>
       </m:oMath>
       <w:r>
-        <w:t xml:space="preserve">, which depends on the queries. If the queries have second-moment matrix </w:t>
+        <w:t xml:space="preserve">, which depends on the queries. Let </w:t>
       </w:r>
       <m:oMath>
         <m:r>
@@ -2808,7 +2858,7 @@
         </m:r>
       </m:oMath>
       <w:r>
-        <w:t xml:space="preserve">, the average squared score error is</w:t>
+        <w:t xml:space="preserve"> be the second-moment matrix of the queries, which describes the directions in which the queries mostly point. The average squared score error is then</w:t>
       </w:r>
     </w:p>
     <w:p>
@@ -2936,7 +2986,7 @@
         </m:r>
       </m:oMath>
       <w:r>
-        <w:t xml:space="preserve">. Image and text queries have very different </w:t>
+        <w:t xml:space="preserve">, that is, when queries point equally in all directions. Image and text queries have very different </w:t>
       </w:r>
       <m:oMath>
         <m:r>
@@ -3061,6 +3111,15 @@
       </w:pPr>
       <w:r>
         <w:t xml:space="preserve">2.6 Why text queries are harder</w:t>
+      </w:r>
+    </w:p>
+    <w:p>
+      <w:pPr>
+        <w:spacing w:after="120" w:line="264"/>
+        <w:jc w:val="both"/>
+      </w:pPr>
+      <w:r>
+        <w:t xml:space="preserve">Before the experiments, we describe the two ways a text query can go wrong. The first affects methods that use approximate scores (LSH and PQ); the second affects graph search (HNSW).</w:t>
       </w:r>
     </w:p>
     <w:p>
@@ -3487,7 +3546,7 @@
         </m:r>
       </m:oMath>
       <w:r>
-        <w:t xml:space="preserve"> (using the median of each projection as the threshold gives 99% the same bits on COCO). But for a text query the offset </w:t>
+        <w:t xml:space="preserve"> (using the median of each projection as the threshold gives 99% the same bits on COCO). But every text vector is shifted from the images by roughly the same offset </w:t>
       </w:r>
       <m:oMath>
         <m:sSub>
@@ -3521,7 +3580,67 @@
         </m:sSub>
       </m:oMath>
       <w:r>
-        <w:t xml:space="preserve"> then dominates, so the query lands on the same side of most hyperplanes whatever its content. We therefore centre each modality on its own mean:</w:t>
+        <w:t xml:space="preserve">. After subtracting </w:t>
+      </w:r>
+      <m:oMath>
+        <m:sSub>
+          <m:sSubPr/>
+          <m:e>
+            <m:r>
+              <m:t xml:space="preserve">μ</m:t>
+            </m:r>
+          </m:e>
+          <m:sub>
+            <m:r>
+              <m:t xml:space="preserve">I</m:t>
+            </m:r>
+          </m:sub>
+        </m:sSub>
+      </m:oMath>
+      <w:r>
+        <w:t xml:space="preserve">, this shared offset dominates </w:t>
+      </w:r>
+      <m:oMath>
+        <m:sSubSup>
+          <m:sSubSupPr/>
+          <m:e>
+            <m:r>
+              <m:t xml:space="preserve">w</m:t>
+            </m:r>
+          </m:e>
+          <m:sub>
+            <m:r>
+              <m:t xml:space="preserve">i</m:t>
+            </m:r>
+          </m:sub>
+          <m:sup>
+            <m:r>
+              <m:t xml:space="preserve">⊤</m:t>
+            </m:r>
+          </m:sup>
+        </m:sSubSup>
+        <m:r>
+          <m:t xml:space="preserve">(q−</m:t>
+        </m:r>
+        <m:sSub>
+          <m:sSubPr/>
+          <m:e>
+            <m:r>
+              <m:t xml:space="preserve">μ</m:t>
+            </m:r>
+          </m:e>
+          <m:sub>
+            <m:r>
+              <m:t xml:space="preserve">I</m:t>
+            </m:r>
+          </m:sub>
+        </m:sSub>
+        <m:r>
+          <m:t xml:space="preserve">)</m:t>
+        </m:r>
+      </m:oMath>
+      <w:r>
+        <w:t xml:space="preserve">, so a text query lands on the same side of most hyperplanes whatever the caption says, and different captions get almost the same binary vector. We therefore centre each modality on its own mean:</w:t>
       </w:r>
     </w:p>
     <w:p>
@@ -3717,7 +3836,7 @@
         </m:r>
       </m:oMath>
       <w:r>
-        <w:t xml:space="preserve">. Let </w:t>
+        <w:t xml:space="preserve">. The idea is to stretch the space in the directions where captions vary most, so that k-means spends more of its precision there. Let </w:t>
       </w:r>
       <m:oMath>
         <m:r>
@@ -3736,6 +3855,14 @@
             </m:r>
           </m:sup>
         </m:sSup>
+      </m:oMath>
+      <w:r>
+        <w:t xml:space="preserve"> be the matrix square root of </w:t>
+      </w:r>
+      <m:oMath>
+        <m:r>
+          <m:t xml:space="preserve">S</m:t>
+        </m:r>
       </m:oMath>
       <w:r>
         <w:t xml:space="preserve">. If we index </w:t>
@@ -5458,7 +5585,7 @@
         <w:jc w:val="both"/>
       </w:pPr>
       <w:r>
-        <w:t xml:space="preserve">We never average image and text recall, because their difference is what we study.</w:t>
+        <w:t xml:space="preserve">A positive Δ means text queries get lower recall than image queries. We never average image and text recall, because their difference is what we study.</w:t>
       </w:r>
     </w:p>
     <w:p>
@@ -11329,7 +11456,7 @@
         <w:t xml:space="preserve">(P1) Low contrast hurts PQ and LSH.</w:t>
       </w:r>
       <w:r>
-        <w:t xml:space="preserve"> For PQ, per-query recall increases with contrast for COCO image and text queries and LAION image queries (Spearman correlation +0.38, +0.51 and +0.33; Figure 6, right), and 39% of COCO text queries get recall below 0.5, against 3% of image queries. LAION text queries are the exception: their recall first rises and then falls with contrast (+0.14), so contrast explains only part of the loss on noisy web text. The PQ score error is actually </w:t>
+        <w:t xml:space="preserve"> For PQ, per-query recall increases with contrast for COCO image and text queries and LAION image queries (Spearman rank correlation +0.38, +0.51 and +0.33, where +1 would mean recall always rises with contrast; Figure 6, right), and 39% of COCO text queries get recall below 0.5, against 3% of image queries. LAION text queries are the exception: their recall first rises and then falls with contrast (+0.14), so contrast explains only part of the loss on noisy web text. The PQ score error is actually </w:t>
       </w:r>
       <w:r>
         <w:rPr>
@@ -11382,7 +11509,15 @@
         <w:t xml:space="preserve">both</w:t>
       </w:r>
       <w:r>
-        <w:t xml:space="preserve"> query types, so the hashing functions treat text and images the same way. The difference is again in the margins: on LAION, the median angle between a query's 100th and 1,000th neighbours is 4.7° for image queries but only 1.8° for text queries. Table 7 shows that Eq. (4) predicts the measured swap rate well.</w:t>
+        <w:t xml:space="preserve"> query types, so the hashing functions treat text and images the same way. The difference is again in the margins: on LAION, the median angle between a query's 100th and 1,000th neighbours is 4.7° for image queries but only 1.8° for text queries. Table 7 shows that Eq. (4) predicts the measured swap rate well. A larger </w:t>
+      </w:r>
+      <m:oMath>
+        <m:r>
+          <m:t xml:space="preserve">z</m:t>
+        </m:r>
+      </m:oMath>
+      <w:r>
+        <w:t xml:space="preserve"> means the two neighbours are easier to tell apart.</w:t>
       </w:r>
     </w:p>
     <w:p>
@@ -13014,7 +13149,7 @@
         <w:t xml:space="preserve">fewer</w:t>
       </w:r>
       <w:r>
-        <w:t xml:space="preserve"> similarities than image queries, yet lose 19 points of recall: the search stops early in the wrong region, as predicted.</w:t>
+        <w:t xml:space="preserve"> similarities than image queries, yet lose 0.19 recall: the search stops early in the wrong region, as predicted.</w:t>
       </w:r>
     </w:p>
     <w:p>
@@ -15518,7 +15653,7 @@
         <w:jc w:val="both"/>
       </w:pPr>
       <w:r>
-        <w:t xml:space="preserve">Better entry points (variant 1) do not help, so the problem is not where the search starts. Captions as nodes (variant 2) make things much worse: a caption node is far more similar to a text query (about 0.8) than any image is (about 0.3), so caption nodes fill the whole candidate list and the search never reaches the images. Caption-guided edges (variant 3) work (Table 9, Figure 9). On COCO, text recall rises from 0.88 to 0.95, Δ drops by 60%, and image recall also rises slightly. At equal recall the modified graph is 1.5 times faster (text recall 0.947 at 2,170 QPS against 0.948 at 1,470 QPS). On LAION, text recall improves by 7 points at </w:t>
+        <w:t xml:space="preserve">Better entry points (variant 1) do not help, so the problem is not where the search starts. Captions as nodes (variant 2) make things much worse: a caption node is far more similar to a text query (about 0.8) than any image is (about 0.3), so caption nodes fill the whole candidate list and the search never reaches the images. Caption-guided edges (variant 3) work (Table 9, Figure 9). On COCO, text recall rises from 0.88 to 0.95, Δ drops by 60%, and image recall also rises slightly. At equal recall the modified graph is 1.5 times faster (text recall 0.947 at 2,170 QPS against 0.948 at 1,470 QPS). On LAION, text recall improves from 0.75 to 0.82 at </w:t>
       </w:r>
       <m:oMath>
         <m:r>
@@ -17377,7 +17512,7 @@
         <w:jc w:val="both"/>
       </w:pPr>
       <w:r>
-        <w:t xml:space="preserve">Figure 12 shows three COCO captions chosen to show the two kinds of failure. For the long caption about a train, HNSW gets stuck in a nearby region and drifts to lorries and car parks (recall@10 = 0.5), while the graph with caption-guided edges returns exactly the true top-10. For the baseball caption, PQ finds the right topic but the wrong order: every result is a reasonable baseball photo, but none is in the exact top-10, because hundreds of images have almost the same score and small errors reshuffle them. A user might still be happy with these results, which is a limitation of measuring recall against linear search. Over all captions, HNSW usually succeeds (text recall@10 of 0.949, and 0.987 with caption-guided edges).</w:t>
+        <w:t xml:space="preserve">Figure 12 shows three COCO captions chosen to show the two kinds of failure, with the top-10 results of each method (so recall@10 is used here). For the long caption about a train, HNSW gets stuck in a nearby region and drifts to lorries and car parks (recall@10 = 0.5), while the graph with caption-guided edges returns exactly the true top-10. For the baseball caption, PQ finds the right topic but the wrong order: every result is a reasonable baseball photo, but none is in the exact top-10, because hundreds of images have almost the same score and small errors reshuffle them. A user might still be happy with these results, which is a limitation of measuring recall against linear search. Over all captions, HNSW usually succeeds (text recall@10 of 0.949, and 0.987 with caption-guided edges).</w:t>
       </w:r>
     </w:p>
     <w:p>

</xml_diff>

<commit_message>
Report: trim basic explanations, keep project context and intuition
</commit_message>
<xml_diff>
--- a/report/group_21_report.docx
+++ b/report/group_21_report.docx
@@ -140,7 +140,7 @@
           <w:sz w:val="22"/>
           <w:szCs w:val="22"/>
         </w:rPr>
-        <w:t xml:space="preserve">Text-to-image search engines turn captions and images into vectors with an embedding model such as CLIP, and then search the image vectors with an approximate nearest neighbour (ANN) method, which builds a search structure (an index) for fast lookup. The index is built from images, but the queries are captions, and CLIP places text and image vectors in different regions of the space (the </w:t>
+        <w:t xml:space="preserve">Text-to-image search engines turn captions and images into vectors with CLIP and then search the image vectors with an approximate nearest neighbour (ANN) index. The index is built from images, but the queries are captions, and CLIP places text and image vectors in different regions of the space (the </w:t>
       </w:r>
       <w:r>
         <w:rPr>
@@ -197,7 +197,7 @@
         </m:r>
       </m:oMath>
       <w:r>
-        <w:t xml:space="preserve"> similarity calculations, which is slow for large databases. On our LAION database of one million images, one linear search takes 104 ms on a single thread. Approximate nearest neighbour (ANN) methods such as LSH and PQ build a data structure, called an index, from the database in advance. At query time they return almost the same top-</w:t>
+        <w:t xml:space="preserve"> similarity calculations, which is slow for large databases. On our LAION database of one million images, one linear search takes 104 ms on a single thread. Approximate nearest neighbour (ANN) methods such as LSH and PQ build an index in advance and return almost the same top-</w:t>
       </w:r>
       <m:oMath>
         <m:r>
@@ -205,7 +205,7 @@
         </m:r>
       </m:oMath>
       <w:r>
-        <w:t xml:space="preserve"> as linear search, but much faster or using much less memory. The goal of an ANN method is therefore to stay as close as possible to the linear search result while saving time or memory.</w:t>
+        <w:t xml:space="preserve"> as linear search, much faster or with much less memory.</w:t>
       </w:r>
     </w:p>
     <w:p>
@@ -214,7 +214,7 @@
         <w:jc w:val="both"/>
       </w:pPr>
       <w:r>
-        <w:t xml:space="preserve">Embedding models such as CLIP (Radford et al., 2021), which is trained on image–caption pairs, map images and text into the same 512-dimensional space, so the same ANN methods can be used to find images with a caption (</w:t>
+        <w:t xml:space="preserve">Models such as CLIP (Radford et al., 2021) map images and text into the same 512-dimensional space, so the same ANN methods can be used to find images with a caption (</w:t>
       </w:r>
       <w:r>
         <w:rPr>
@@ -234,7 +234,7 @@
         <w:t xml:space="preserve">modality gap</w:t>
       </w:r>
       <w:r>
-        <w:t xml:space="preserve"> comes from the embedding model, not from the index; the index only inherits it. Queries that come from a different distribution than the database are called out-of-distribution (OOD). The VIBE benchmark (Jääsaari et al., 2026) shows that ANN methods become much slower on OOD queries, and two graph methods, RoarGraph (Chen et al., 2024) and OOD-DiskANN (Jaiswal et al., 2022), use a sample of past queries to handle them. We study the problem across three different ANN families. As a baseline, we also search each index with image queries. These come from the same distribution as the database (in-distribution), as in standard ANN benchmarks. Comparing them with text queries on the same index shows how much recall is lost only because the query is text.</w:t>
+        <w:t xml:space="preserve"> comes from the embedding model, not from the index; the index only inherits it. The VIBE benchmark (Jääsaari et al., 2026) shows that ANN methods become much slower on such out-of-distribution (OOD) queries, and two graph methods, RoarGraph (Chen et al., 2024) and OOD-DiskANN (Jaiswal et al., 2022), use a sample of past queries to handle them. We study the problem across three different ANN families. As a baseline, we also search each index with image queries. These come from the same distribution as the database (in-distribution), as in standard ANN benchmarks. Comparing them with text queries on the same index shows how much recall is lost only because the query is text.</w:t>
       </w:r>
     </w:p>
     <w:p>
@@ -583,7 +583,7 @@
         </m:r>
       </m:oMath>
       <w:r>
-        <w:t xml:space="preserve">, which we compare with the exact list from linear search. In words, recall@100 = 0.9 means the method found 90 of the true 100 most similar images:</w:t>
+        <w:t xml:space="preserve">, which we compare with the exact list from linear search.:</w:t>
       </w:r>
     </w:p>
     <w:p>
@@ -2052,7 +2052,7 @@
         </m:sSub>
       </m:oMath>
       <w:r>
-        <w:t xml:space="preserve"> (the number of bits that differ), which only needs an XOR and a bit count, so it is much cheaper than a distance on float values. A 512-bit binary vector takes 64 bytes, 32 times less than the 2,048-byte float vector. We use LSH + linear search, implemented with IndexLSH from the FAISS library (Douze et al., 2024), instead of hash tables because it returns a full top-100 list. Results are averaged over three random seeds (standard deviation of recall below 0.01).</w:t>
+        <w:t xml:space="preserve">, which only needs an XOR and a bit count, so it is much cheaper than a distance on float values. A 512-bit binary vector takes 64 bytes, 32 times less than the 2,048-byte float vector. We use LSH + linear search, implemented with IndexLSH from the FAISS library (Douze et al., 2024), instead of hash tables because it returns a full top-100 list. Results are averaged over three random seeds (standard deviation of recall below 0.01).</w:t>
       </w:r>
     </w:p>
     <w:p>
@@ -2092,7 +2092,7 @@
         </m:r>
       </m:oMath>
       <w:r>
-        <w:t xml:space="preserve"> (a smaller angle means more similar). A random hyperplane separates two vectors with a probability equal to this angle divided by </w:t>
+        <w:t xml:space="preserve">. A random hyperplane separates two vectors with a probability equal to this angle divided by </w:t>
       </w:r>
       <m:oMath>
         <m:r>
@@ -2858,7 +2858,7 @@
         </m:r>
       </m:oMath>
       <w:r>
-        <w:t xml:space="preserve"> be the second-moment matrix of the queries, which describes the directions in which the queries mostly point. The average squared score error is then</w:t>
+        <w:t xml:space="preserve"> be the second-moment matrix of the queries (roughly, which directions they point in). The average squared score error is then</w:t>
       </w:r>
     </w:p>
     <w:p>
@@ -2986,7 +2986,7 @@
         </m:r>
       </m:oMath>
       <w:r>
-        <w:t xml:space="preserve">, that is, when queries point equally in all directions. Image and text queries have very different </w:t>
+        <w:t xml:space="preserve"> (isotropic queries). Image and text queries have very different </w:t>
       </w:r>
       <m:oMath>
         <m:r>
@@ -3857,14 +3857,6 @@
         </m:sSup>
       </m:oMath>
       <w:r>
-        <w:t xml:space="preserve"> be the matrix square root of </w:t>
-      </w:r>
-      <m:oMath>
-        <m:r>
-          <m:t xml:space="preserve">S</m:t>
-        </m:r>
-      </m:oMath>
-      <w:r>
         <w:t xml:space="preserve">. If we index </w:t>
       </w:r>
       <m:oMath>
@@ -5585,7 +5577,7 @@
         <w:jc w:val="both"/>
       </w:pPr>
       <w:r>
-        <w:t xml:space="preserve">A positive Δ means text queries get lower recall than image queries. We never average image and text recall, because their difference is what we study.</w:t>
+        <w:t xml:space="preserve">We never average image and text recall, because their difference is what we study.</w:t>
       </w:r>
     </w:p>
     <w:p>
@@ -11456,7 +11448,7 @@
         <w:t xml:space="preserve">(P1) Low contrast hurts PQ and LSH.</w:t>
       </w:r>
       <w:r>
-        <w:t xml:space="preserve"> For PQ, per-query recall increases with contrast for COCO image and text queries and LAION image queries (Spearman rank correlation +0.38, +0.51 and +0.33, where +1 would mean recall always rises with contrast; Figure 6, right), and 39% of COCO text queries get recall below 0.5, against 3% of image queries. LAION text queries are the exception: their recall first rises and then falls with contrast (+0.14), so contrast explains only part of the loss on noisy web text. The PQ score error is actually </w:t>
+        <w:t xml:space="preserve"> For PQ, per-query recall increases with contrast for COCO image and text queries and LAION image queries (Spearman rank correlation +0.38, +0.51 and +0.33; Figure 6, right), and 39% of COCO text queries get recall below 0.5, against 3% of image queries. LAION text queries are the exception: their recall first rises and then falls with contrast (+0.14), so contrast explains only part of the loss on noisy web text. The PQ score error is actually </w:t>
       </w:r>
       <w:r>
         <w:rPr>

</xml_diff>

<commit_message>
Report: restore ANN goal, Hamming, Spearman, isotropy and delta explanations
</commit_message>
<xml_diff>
--- a/report/group_21_report.docx
+++ b/report/group_21_report.docx
@@ -197,7 +197,7 @@
         </m:r>
       </m:oMath>
       <w:r>
-        <w:t xml:space="preserve"> similarity calculations, which is slow for large databases. On our LAION database of one million images, one linear search takes 104 ms on a single thread. Approximate nearest neighbour (ANN) methods such as LSH and PQ build an index in advance and return almost the same top-</w:t>
+        <w:t xml:space="preserve"> similarity calculations, which is slow for large databases. On our LAION database of one million images, one linear search takes 104 ms on a single thread. Approximate nearest neighbour (ANN) methods such as LSH and PQ build a data structure, called an index, from the database in advance. Their goal is to return almost the same top-</w:t>
       </w:r>
       <m:oMath>
         <m:r>
@@ -205,7 +205,7 @@
         </m:r>
       </m:oMath>
       <w:r>
-        <w:t xml:space="preserve"> as linear search, much faster or with much less memory.</w:t>
+        <w:t xml:space="preserve"> as linear search, but much faster or using much less memory. So each method is judged on three things: how close its results are to linear search (recall), its speed, and its memory.</w:t>
       </w:r>
     </w:p>
     <w:p>
@@ -2052,7 +2052,7 @@
         </m:sSub>
       </m:oMath>
       <w:r>
-        <w:t xml:space="preserve">, which only needs an XOR and a bit count, so it is much cheaper than a distance on float values. A 512-bit binary vector takes 64 bytes, 32 times less than the 2,048-byte float vector. We use LSH + linear search, implemented with IndexLSH from the FAISS library (Douze et al., 2024), instead of hash tables because it returns a full top-100 list. Results are averaged over three random seeds (standard deviation of recall below 0.01).</w:t>
+        <w:t xml:space="preserve"> (the number of bits that differ), which only needs an XOR and a bit count, so it is much cheaper than a distance on float values. A 512-bit binary vector takes 64 bytes, 32 times less than the 2,048-byte float vector. We use LSH + linear search, implemented with IndexLSH from the FAISS library (Douze et al., 2024), instead of hash tables because it returns a full top-100 list. Results are averaged over three random seeds (standard deviation of recall below 0.01).</w:t>
       </w:r>
     </w:p>
     <w:p>
@@ -2986,7 +2986,7 @@
         </m:r>
       </m:oMath>
       <w:r>
-        <w:t xml:space="preserve"> (isotropic queries). Image and text queries have very different </w:t>
+        <w:t xml:space="preserve">, i.e. when the queries point equally in all directions. Image and text queries have very different </w:t>
       </w:r>
       <m:oMath>
         <m:r>
@@ -5577,7 +5577,7 @@
         <w:jc w:val="both"/>
       </w:pPr>
       <w:r>
-        <w:t xml:space="preserve">We never average image and text recall, because their difference is what we study.</w:t>
+        <w:t xml:space="preserve">A positive Δ means text queries get lower recall than image queries. We never average image and text recall, because their difference is what we study.</w:t>
       </w:r>
     </w:p>
     <w:p>
@@ -11448,7 +11448,7 @@
         <w:t xml:space="preserve">(P1) Low contrast hurts PQ and LSH.</w:t>
       </w:r>
       <w:r>
-        <w:t xml:space="preserve"> For PQ, per-query recall increases with contrast for COCO image and text queries and LAION image queries (Spearman rank correlation +0.38, +0.51 and +0.33; Figure 6, right), and 39% of COCO text queries get recall below 0.5, against 3% of image queries. LAION text queries are the exception: their recall first rises and then falls with contrast (+0.14), so contrast explains only part of the loss on noisy web text. The PQ score error is actually </w:t>
+        <w:t xml:space="preserve"> For PQ, per-query recall increases with contrast for COCO image and text queries and LAION image queries (Spearman rank correlation +0.38, +0.51 and +0.33, where +1 would mean recall always rises with contrast; Figure 6, right), and 39% of COCO text queries get recall below 0.5, against 3% of image queries. LAION text queries are the exception: their recall first rises and then falls with contrast (+0.14), so contrast explains only part of the loss on noisy web text. The PQ score error is actually </w:t>
       </w:r>
       <w:r>
         <w:rPr>

</xml_diff>